<commit_message>
feat(full-report): adapt component scanning templates (#29)
Adapt 7 dedicated Jinja2 templates in NORMAL IR US TEV/ with transparent
placeholders for photos, thermal/electrical readings, and banners.
Decouple from QUICK REPORT/ and add 28 smoke validation tests.
</commit_message>
<xml_diff>
--- a/templates/FULL REPORT/NORMAL IR US TEV/battery-overview.docx
+++ b/templates/FULL REPORT/NORMAL IR US TEV/battery-overview.docx
@@ -307,7 +307,7 @@
               <w:rPr>
                 <w:rFonts w:cstheme="minorHAnsi"/>
               </w:rPr>
-              <w:t>{{ batt.manufacturer }}</w:t>
+              <w:t>{{ (battery.manufacturer if battery is defined else None) or batt.manufacturer }}</w:t>
             </w:r>
           </w:p>
         </w:tc>
@@ -403,7 +403,7 @@
               <w:rPr>
                 <w:rFonts w:cstheme="minorHAnsi"/>
               </w:rPr>
-              <w:t>{{ batt.model }}</w:t>
+              <w:t>{{ (battery.model if battery is defined else None) or batt.model }}</w:t>
             </w:r>
           </w:p>
         </w:tc>
@@ -448,7 +448,7 @@
                 <w:rFonts w:cstheme="minorHAnsi"/>
                 <w:color w:val="000000"/>
               </w:rPr>
-              <w:t>240V/50Hz</w:t>
+              <w:t>{{ (battery.rating if battery is defined else None) or batt.rating or '240V/50Hz' }}</w:t>
             </w:r>
           </w:p>
         </w:tc>
@@ -544,7 +544,7 @@
               <w:rPr>
                 <w:rFonts w:cstheme="minorHAnsi"/>
               </w:rPr>
-              <w:t>OVERVIEW</w:t>
+              <w:t>{{ (battery.area if battery is defined else None) or batt.area or 'OVERVIEW' }}</w:t>
             </w:r>
           </w:p>
         </w:tc>
@@ -588,7 +588,7 @@
               <w:rPr>
                 <w:rFonts w:cstheme="minorHAnsi"/>
               </w:rPr>
-              <w:t>{{ batt.number }}</w:t>
+              <w:t>{{ (battery.number if battery is defined else None) or batt.number }}</w:t>
             </w:r>
           </w:p>
         </w:tc>
@@ -1014,31 +1014,7 @@
                 <w:kern w:val="0"/>
                 <w14:ligatures w14:val="none"/>
               </w:rPr>
-              <w:object w:dxaOrig="225" w:dyaOrig="225" w14:anchorId="55BE1238">
-                <v:shapetype id="_x0000_t75" coordsize="21600,21600" o:spt="75" o:preferrelative="t" path="m@4@5l@4@11@9@11@9@5xe" filled="f" stroked="f">
-                  <v:stroke joinstyle="miter"/>
-                  <v:formulas>
-                    <v:f eqn="if lineDrawn pixelLineWidth 0"/>
-                    <v:f eqn="sum @0 1 0"/>
-                    <v:f eqn="sum 0 0 @1"/>
-                    <v:f eqn="prod @2 1 2"/>
-                    <v:f eqn="prod @3 21600 pixelWidth"/>
-                    <v:f eqn="prod @3 21600 pixelHeight"/>
-                    <v:f eqn="sum @0 0 1"/>
-                    <v:f eqn="prod @6 1 2"/>
-                    <v:f eqn="prod @7 21600 pixelWidth"/>
-                    <v:f eqn="sum @8 21600 0"/>
-                    <v:f eqn="prod @7 21600 pixelHeight"/>
-                    <v:f eqn="sum @10 21600 0"/>
-                  </v:formulas>
-                  <v:path o:extrusionok="f" gradientshapeok="t" o:connecttype="rect"/>
-                  <o:lock v:ext="edit" aspectratio="t"/>
-                </v:shapetype>
-                <v:shape id="_x0000_i1027" type="#_x0000_t75" style="width:238.05pt;height:147.65pt" o:ole="">
-                  <v:imagedata r:id="rId7" o:title="" croptop="1206f" cropbottom="3617f" cropleft="781f" cropright="781f"/>
-                </v:shape>
-                <w:control r:id="rId8" w:name="CIRViewer121111113121111" w:shapeid="_x0000_i1027"/>
-              </w:object>
+              <w:t>{{ ir.image }}</w:t>
             </w:r>
           </w:p>
         </w:tc>
@@ -1435,6 +1411,9 @@
                 <w:szCs w:val="18"/>
               </w:rPr>
             </w:pPr>
+            <w:r>
+              <w:t>{{ ir.sp1 }}</w:t>
+            </w:r>
           </w:p>
         </w:tc>
         <w:tc>
@@ -1599,7 +1578,7 @@
                 <w:sz w:val="20"/>
                 <w:szCs w:val="18"/>
               </w:rPr>
-              <w:t>-</w:t>
+              <w:t>{{ ir.sp2 }}</w:t>
             </w:r>
           </w:p>
         </w:tc>
@@ -1672,7 +1651,7 @@
                 <w:sz w:val="20"/>
                 <w:szCs w:val="18"/>
               </w:rPr>
-              <w:t>{{ batt.serialnumber }}</w:t>
+              <w:t>{{ (battery.serialnumber if battery is defined else None) or batt.serialnumber }}</w:t>
             </w:r>
           </w:p>
         </w:tc>
@@ -1769,7 +1748,7 @@
                 <w:sz w:val="20"/>
                 <w:szCs w:val="18"/>
               </w:rPr>
-              <w:fldChar w:fldCharType="begin"/>
+              <w:t>{{ ir.ar1 or ir.reading }}</w:t>
             </w:r>
             <w:r>
               <w:rPr>
@@ -1777,7 +1756,6 @@
                 <w:sz w:val="20"/>
                 <w:szCs w:val="18"/>
               </w:rPr>
-              <w:instrText xml:space="preserve">DOCVARIABLE _Fd324361695 \* MERGEFORMAT </w:instrText>
             </w:r>
             <w:r>
               <w:rPr>
@@ -1785,7 +1763,6 @@
                 <w:sz w:val="20"/>
                 <w:szCs w:val="18"/>
               </w:rPr>
-              <w:fldChar w:fldCharType="separate"/>
             </w:r>
             <w:r>
               <w:rPr>
@@ -1793,7 +1770,6 @@
                 <w:sz w:val="20"/>
                 <w:szCs w:val="18"/>
               </w:rPr>
-              <w:t xml:space="preserve">30.0 °C </w:t>
             </w:r>
             <w:r>
               <w:rPr>
@@ -1801,7 +1777,6 @@
                 <w:sz w:val="20"/>
                 <w:szCs w:val="18"/>
               </w:rPr>
-              <w:fldChar w:fldCharType="end"/>
             </w:r>
           </w:p>
         </w:tc>
@@ -2142,7 +2117,7 @@
                 <w:sz w:val="20"/>
                 <w:szCs w:val="20"/>
               </w:rPr>
-              <w:t>-</w:t>
+              <w:t>{{ ir.delta_t }}</w:t>
             </w:r>
           </w:p>
         </w:tc>
@@ -4881,20 +4856,18 @@
                 <w:b/>
                 <w:i/>
               </w:rPr>
-              <w:lastRenderedPageBreak/>
-              <w:t xml:space="preserve">Analysis: </w:t>
-            </w:r>
-            <w:r>
-              <w:rPr>
-                <w:rFonts w:cstheme="minorHAnsi"/>
-              </w:rPr>
-              <w:t xml:space="preserve"> </w:t>
-            </w:r>
-            <w:r>
-              <w:rPr>
-                <w:rFonts w:cstheme="minorHAnsi"/>
-              </w:rPr>
-              <w:t>{{ analysis }}</w:t>
+              <w:t xml:space="preserve">Analysis:  </w:t>
+            </w:r>
+            <w:r>
+              <w:rPr>
+                <w:rFonts w:cstheme="minorHAnsi"/>
+              </w:rPr>
+              <w:t>{{ banner.analysis or analysis }}</w:t>
+            </w:r>
+            <w:r>
+              <w:rPr>
+                <w:rFonts w:cstheme="minorHAnsi"/>
+              </w:rPr>
             </w:r>
           </w:p>
         </w:tc>
@@ -4930,7 +4903,7 @@
                 <w:noProof/>
                 <w:lang w:val="en-US"/>
               </w:rPr>
-              <w:t xml:space="preserve">Recommendation: </w:t>
+              <w:t xml:space="preserve">Recommendation:  </w:t>
             </w:r>
             <w:r>
               <w:rPr>
@@ -4938,7 +4911,7 @@
                 <w:noProof/>
                 <w:lang w:val="en-US"/>
               </w:rPr>
-              <w:t xml:space="preserve"> </w:t>
+              <w:t>{{ banner.recommendation or recommendation }}</w:t>
             </w:r>
             <w:r>
               <w:rPr>
@@ -4946,7 +4919,6 @@
                 <w:noProof/>
                 <w:lang w:val="en-US"/>
               </w:rPr>
-              <w:t>{{ recommendation }}</w:t>
             </w:r>
           </w:p>
         </w:tc>

</xml_diff>

<commit_message>
feat(full-report): resolve benchmark bugs (#38)
- Restore FLIR ActiveX controls on normal scanning templates
- Unify cell shading engine across Quick and Full reports
- Isolate batch temp directories per substation under .temp/
- Wire PRPD graphs and testsheet environment readings
- Support project-centric template discovery and sync
- Dynamically merge transformer and switchgear census rows
- Harden Word COM teardown to prevent RPC exceptions

Closes #38
</commit_message>
<xml_diff>
--- a/templates/FULL REPORT/NORMAL IR US TEV/battery-overview.docx
+++ b/templates/FULL REPORT/NORMAL IR US TEV/battery-overview.docx
@@ -307,7 +307,7 @@
               <w:rPr>
                 <w:rFonts w:cstheme="minorHAnsi"/>
               </w:rPr>
-              <w:t>{{ (battery.manufacturer if battery is defined else None) or batt.manufacturer }}</w:t>
+              <w:t>{{ batt.manufacturer }}</w:t>
             </w:r>
           </w:p>
         </w:tc>
@@ -403,7 +403,7 @@
               <w:rPr>
                 <w:rFonts w:cstheme="minorHAnsi"/>
               </w:rPr>
-              <w:t>{{ (battery.model if battery is defined else None) or batt.model }}</w:t>
+              <w:t>{{ batt.model }}</w:t>
             </w:r>
           </w:p>
         </w:tc>
@@ -448,7 +448,7 @@
                 <w:rFonts w:cstheme="minorHAnsi"/>
                 <w:color w:val="000000"/>
               </w:rPr>
-              <w:t>{{ (battery.rating if battery is defined else None) or batt.rating or '240V/50Hz' }}</w:t>
+              <w:t>240V/50Hz</w:t>
             </w:r>
           </w:p>
         </w:tc>
@@ -544,7 +544,7 @@
               <w:rPr>
                 <w:rFonts w:cstheme="minorHAnsi"/>
               </w:rPr>
-              <w:t>{{ (battery.area if battery is defined else None) or batt.area or 'OVERVIEW' }}</w:t>
+              <w:t>OVERVIEW</w:t>
             </w:r>
           </w:p>
         </w:tc>
@@ -588,7 +588,7 @@
               <w:rPr>
                 <w:rFonts w:cstheme="minorHAnsi"/>
               </w:rPr>
-              <w:t>{{ (battery.number if battery is defined else None) or batt.number }}</w:t>
+              <w:t>{{ batt.number }}</w:t>
             </w:r>
           </w:p>
         </w:tc>
@@ -1014,7 +1014,31 @@
                 <w:kern w:val="0"/>
                 <w14:ligatures w14:val="none"/>
               </w:rPr>
-              <w:t>{{ ir.image }}</w:t>
+              <w:object w:dxaOrig="225" w:dyaOrig="225" w14:anchorId="55BE1238">
+                <v:shapetype id="_x0000_t75" coordsize="21600,21600" o:spt="75" o:preferrelative="t" path="m@4@5l@4@11@9@11@9@5xe" filled="f" stroked="f">
+                  <v:stroke joinstyle="miter"/>
+                  <v:formulas>
+                    <v:f eqn="if lineDrawn pixelLineWidth 0"/>
+                    <v:f eqn="sum @0 1 0"/>
+                    <v:f eqn="sum 0 0 @1"/>
+                    <v:f eqn="prod @2 1 2"/>
+                    <v:f eqn="prod @3 21600 pixelWidth"/>
+                    <v:f eqn="prod @3 21600 pixelHeight"/>
+                    <v:f eqn="sum @0 0 1"/>
+                    <v:f eqn="prod @6 1 2"/>
+                    <v:f eqn="prod @7 21600 pixelWidth"/>
+                    <v:f eqn="sum @8 21600 0"/>
+                    <v:f eqn="prod @7 21600 pixelHeight"/>
+                    <v:f eqn="sum @10 21600 0"/>
+                  </v:formulas>
+                  <v:path o:extrusionok="f" gradientshapeok="t" o:connecttype="rect"/>
+                  <o:lock v:ext="edit" aspectratio="t"/>
+                </v:shapetype>
+                <v:shape id="_x0000_i1030" type="#_x0000_t75" style="width:237.7pt;height:147.45pt" o:ole="">
+                  <v:imagedata r:id="rId7" o:title="" croptop="1206f" cropbottom="3617f" cropleft="781f" cropright="781f"/>
+                </v:shape>
+                <w:control r:id="rId8" w:name="CIRViewer121111113121111" w:shapeid="_x0000_i1030"/>
+              </w:object>
             </w:r>
           </w:p>
         </w:tc>
@@ -1411,9 +1435,6 @@
                 <w:szCs w:val="18"/>
               </w:rPr>
             </w:pPr>
-            <w:r>
-              <w:t>{{ ir.sp1 }}</w:t>
-            </w:r>
           </w:p>
         </w:tc>
         <w:tc>
@@ -1578,7 +1599,7 @@
                 <w:sz w:val="20"/>
                 <w:szCs w:val="18"/>
               </w:rPr>
-              <w:t>{{ ir.sp2 }}</w:t>
+              <w:t>-</w:t>
             </w:r>
           </w:p>
         </w:tc>
@@ -1651,7 +1672,7 @@
                 <w:sz w:val="20"/>
                 <w:szCs w:val="18"/>
               </w:rPr>
-              <w:t>{{ (battery.serialnumber if battery is defined else None) or batt.serialnumber }}</w:t>
+              <w:t>{{ batt.serialnumber }}</w:t>
             </w:r>
           </w:p>
         </w:tc>
@@ -1748,7 +1769,7 @@
                 <w:sz w:val="20"/>
                 <w:szCs w:val="18"/>
               </w:rPr>
-              <w:t>{{ ir.ar1 or ir.reading }}</w:t>
+              <w:fldChar w:fldCharType="begin"/>
             </w:r>
             <w:r>
               <w:rPr>
@@ -1756,6 +1777,7 @@
                 <w:sz w:val="20"/>
                 <w:szCs w:val="18"/>
               </w:rPr>
+              <w:instrText xml:space="preserve">DOCVARIABLE _Fd1255641131 \* MERGEFORMAT </w:instrText>
             </w:r>
             <w:r>
               <w:rPr>
@@ -1763,6 +1785,7 @@
                 <w:sz w:val="20"/>
                 <w:szCs w:val="18"/>
               </w:rPr>
+              <w:fldChar w:fldCharType="separate"/>
             </w:r>
             <w:r>
               <w:rPr>
@@ -1770,6 +1793,7 @@
                 <w:sz w:val="20"/>
                 <w:szCs w:val="18"/>
               </w:rPr>
+              <w:t xml:space="preserve">30.0 °C </w:t>
             </w:r>
             <w:r>
               <w:rPr>
@@ -1777,6 +1801,7 @@
                 <w:sz w:val="20"/>
                 <w:szCs w:val="18"/>
               </w:rPr>
+              <w:fldChar w:fldCharType="end"/>
             </w:r>
           </w:p>
         </w:tc>
@@ -2117,7 +2142,7 @@
                 <w:sz w:val="20"/>
                 <w:szCs w:val="20"/>
               </w:rPr>
-              <w:t>{{ ir.delta_t }}</w:t>
+              <w:t>-</w:t>
             </w:r>
           </w:p>
         </w:tc>
@@ -4856,18 +4881,20 @@
                 <w:b/>
                 <w:i/>
               </w:rPr>
-              <w:t xml:space="preserve">Analysis:  </w:t>
-            </w:r>
-            <w:r>
-              <w:rPr>
-                <w:rFonts w:cstheme="minorHAnsi"/>
-              </w:rPr>
-              <w:t>{{ banner.analysis or analysis }}</w:t>
-            </w:r>
-            <w:r>
-              <w:rPr>
-                <w:rFonts w:cstheme="minorHAnsi"/>
-              </w:rPr>
+              <w:lastRenderedPageBreak/>
+              <w:t xml:space="preserve">Analysis: </w:t>
+            </w:r>
+            <w:r>
+              <w:rPr>
+                <w:rFonts w:cstheme="minorHAnsi"/>
+              </w:rPr>
+              <w:t xml:space="preserve"> </w:t>
+            </w:r>
+            <w:r>
+              <w:rPr>
+                <w:rFonts w:cstheme="minorHAnsi"/>
+              </w:rPr>
+              <w:t>{{ analysis }}</w:t>
             </w:r>
           </w:p>
         </w:tc>
@@ -4903,7 +4930,7 @@
                 <w:noProof/>
                 <w:lang w:val="en-US"/>
               </w:rPr>
-              <w:t xml:space="preserve">Recommendation:  </w:t>
+              <w:t xml:space="preserve">Recommendation: </w:t>
             </w:r>
             <w:r>
               <w:rPr>
@@ -4911,7 +4938,7 @@
                 <w:noProof/>
                 <w:lang w:val="en-US"/>
               </w:rPr>
-              <w:t>{{ banner.recommendation or recommendation }}</w:t>
+              <w:t xml:space="preserve"> </w:t>
             </w:r>
             <w:r>
               <w:rPr>
@@ -4919,6 +4946,7 @@
                 <w:noProof/>
                 <w:lang w:val="en-US"/>
               </w:rPr>
+              <w:t>{{ recommendation }}</w:t>
             </w:r>
           </w:p>
         </w:tc>

</xml_diff>